<commit_message>
Align declaration mapping docs
</commit_message>
<xml_diff>
--- a/最新逻辑_请优先看/报关单生成取值逻辑说明.docx
+++ b/最新逻辑_请优先看/报关单生成取值逻辑说明.docx
@@ -3727,7 +3727,7 @@
                 <w:szCs w:val="17"/>
                 <w:rFonts w:ascii="Arial" w:hAnsi="Arial" w:eastAsia="Microsoft YaHei"/>
               </w:rPr>
-              <w:t>Invoice.IMOS P/N = Packing.IMOS PN</w:t>
+              <w:t>不使用 IMOS P/N / IMOS PN</w:t>
             </w:r>
           </w:p>
         </w:tc>
@@ -3754,7 +3754,7 @@
                 <w:szCs w:val="17"/>
                 <w:rFonts w:ascii="Arial" w:hAnsi="Arial" w:eastAsia="Microsoft YaHei"/>
               </w:rPr>
-              <w:t>备用规则，只在 QAD PN 缺失或不一致时使用。</w:t>
+              <w:t>不作为匹配字段；即使源表存在也忽略。按 QAD PN 匹配不到则进入异常清单。</w:t>
             </w:r>
           </w:p>
         </w:tc>

</xml_diff>

<commit_message>
Update declaration country logic and config docs
</commit_message>
<xml_diff>
--- a/最新逻辑_请优先看/报关单生成取值逻辑说明.docx
+++ b/最新逻辑_请优先看/报关单生成取值逻辑说明.docx
@@ -705,7 +705,7 @@
           <ns0:szCs ns0:val="21"/>
           <ns0:rFonts ns0:ascii="Arial" ns0:hAnsi="Arial" ns0:eastAsia="Microsoft YaHei"/>
         </ns0:rPr>
-        <ns0:t>填写报关单：按字段来源表把基础信息和商品明细写入空白模板。</ns0:t>
+        <ns0:t xml:space="preserve">填写报关单：按字段来源表把基础信息和商品明细写入空白模板；生成文件不得保留隐藏行。</ns0:t>
       </ns0:r>
     </ns0:p>
     <ns0:p>
@@ -1664,7 +1664,7 @@
                 <ns0:szCs ns0:val="17"/>
                 <ns0:rFonts ns0:ascii="Arial" ns0:hAnsi="Arial" ns0:eastAsia="Microsoft YaHei"/>
               </ns0:rPr>
-              <ns0:t>贸易国/运抵国/最终目的国</ns0:t>
+              <ns0:t xml:space="preserve">贸易国/运抵国/最终目的国</ns0:t>
             </ns0:r>
           </ns0:p>
         </ns0:tc>
@@ -1691,7 +1691,7 @@
                 <ns0:szCs ns0:val="17"/>
                 <ns0:rFonts ns0:ascii="Arial" ns0:hAnsi="Arial" ns0:eastAsia="Microsoft YaHei"/>
               </ns0:rPr>
-              <ns0:t>客户名称或收货地址</ns0:t>
+              <ns0:t xml:space="preserve">Invoice Bill to / Ship to 地址块</ns0:t>
             </ns0:r>
           </ns0:p>
         </ns0:tc>
@@ -1718,7 +1718,7 @@
                 <ns0:szCs ns0:val="17"/>
                 <ns0:rFonts ns0:ascii="Arial" ns0:hAnsi="Arial" ns0:eastAsia="Microsoft YaHei"/>
               </ns0:rPr>
-              <ns0:t>根据 CASCO Imos Italia / CONDOVE 推断为意大利。</ns0:t>
+              <ns0:t xml:space="preserve">贸易国取 Bill to 国家；运抵国取 Ship to 国家；英文国家名翻译成中文，例如 Vietnam -&gt; 越南、Italy -&gt; 意大利。</ns0:t>
             </ns0:r>
           </ns0:p>
         </ns0:tc>
@@ -3030,7 +3030,7 @@
                 <ns0:szCs ns0:val="17"/>
                 <ns0:rFonts ns0:ascii="Arial" ns0:hAnsi="Arial" ns0:eastAsia="Microsoft YaHei"/>
               </ns0:rPr>
-              <ns0:t>最终目的国</ns0:t>
+              <ns0:t xml:space="preserve">最终目的国</ns0:t>
             </ns0:r>
           </ns0:p>
         </ns0:tc>
@@ -3057,7 +3057,7 @@
                 <ns0:szCs ns0:val="17"/>
                 <ns0:rFonts ns0:ascii="Arial" ns0:hAnsi="Arial" ns0:eastAsia="Microsoft YaHei"/>
               </ns0:rPr>
-              <ns0:t>客户/收货地址推断</ns0:t>
+              <ns0:t xml:space="preserve">等于运抵国</ns0:t>
             </ns0:r>
           </ns0:p>
         </ns0:tc>
@@ -3084,7 +3084,7 @@
                 <ns0:szCs ns0:val="17"/>
                 <ns0:rFonts ns0:ascii="Arial" ns0:hAnsi="Arial" ns0:eastAsia="Microsoft YaHei"/>
               </ns0:rPr>
-              <ns0:t>当前样例推断为意大利。</ns0:t>
+              <ns0:t xml:space="preserve">商品行最终目的国 M列固定填写运抵国，不允许空白。</ns0:t>
             </ns0:r>
           </ns0:p>
         </ns0:tc>
@@ -5190,7 +5190,7 @@
                 <ns0:szCs ns0:val="17"/>
                 <ns0:rFonts ns0:ascii="Arial" ns0:hAnsi="Arial" ns0:eastAsia="Microsoft YaHei"/>
               </ns0:rPr>
-              <ns0:t>最终目的国</ns0:t>
+              <ns0:t xml:space="preserve">最终目的国</ns0:t>
             </ns0:r>
           </ns0:p>
         </ns0:tc>
@@ -7118,7 +7118,7 @@
                 <ns0:szCs ns0:val="20"/>
                 <ns0:rFonts ns0:ascii="Arial" ns0:hAnsi="Arial" ns0:eastAsia="Microsoft YaHei"/>
               </ns0:rPr>
-              <ns0:t xml:space="preserve">当前逻辑是：Invoice 负责发票号、日期、客户、运输方式、成交方式、料号、数量、单价、总价和币制；发票号从 Serial No. 取，支持 SP/PS 等编号；境外收货人优先从 Ship to 公司名取。Packing list 负责重量、包装、托盘数/件数，支持 Quantity (EA)、N W/G W、6 pallets 等写法；Daily/商品主数据是料号对应 HS code、中文品名、品牌的唯一来源；空白模板只提供格式；旧报关单不提供业务数值。商品按 HS code + 中文品名 + 品牌 + 币制 + 目的国 合并，车型不参与合并。运输方式按水路/航空标准化；监管方式、征免性质、离境口岸、商品行征免按固定默认值填写。</ns0:t>
+              <ns0:t xml:space="preserve">当前逻辑是：Invoice 负责发票号、日期、客户、运输方式、成交方式、料号、数量、单价、总价和币制；发票号从 Serial No. 取，支持 SP/PS 等编号；境外收货人优先从 Ship to 公司名取；贸易国=Bill to 国家，运抵国=Ship to 国家，英文国家名翻译成中文，最终目的国=运抵国。Packing list 负责重量、包装、托盘数/件数，支持 Quantity (EA)、N W/G W、6 pallets 等写法；Daily/商品主数据是料号对应 HS code、中文品名、品牌的唯一来源；空白模板只提供格式；旧报关单不提供业务数值；生成文件不得保留隐藏行。商品按 HS code + 中文品名 + 品牌 + 币制 + 目的国 合并，车型不参与合并。运输方式按水路/航空标准化；监管方式、征免性质、离境口岸、商品行征免按固定默认值填写。</ns0:t>
             </ns0:r>
           </ns0:p>
         </ns0:tc>

</xml_diff>

<commit_message>
Integrate report merge into desktop app
</commit_message>
<xml_diff>
--- a/最新逻辑_请优先看/报关单生成取值逻辑说明.docx
+++ b/最新逻辑_请优先看/报关单生成取值逻辑说明.docx
@@ -603,7 +603,7 @@
           <ns0:szCs ns0:val="21"/>
           <ns0:rFonts ns0:ascii="Arial" ns0:hAnsi="Arial" ns0:eastAsia="Microsoft YaHei"/>
         </ns0:rPr>
-        <ns0:t xml:space="preserve">读取字段映射：把源表里的 QAD PN、qty./Quantity/Quantity (EA)、Amount、N.W.(KG)/N W (KGS)、G.W.(KG)/G W (KGS) 等字段转成系统标准字段。</ns0:t>
+        <ns0:t>字段识别：程序按内置别名识别 QAD P/N、数量、金额、净重和毛重等核心字段；字段映射表记录当前支持口径。</ns0:t>
       </ns0:r>
     </ns0:p>
     <ns0:p>
@@ -637,7 +637,7 @@
           <ns0:szCs ns0:val="21"/>
           <ns0:rFonts ns0:ascii="Arial" ns0:hAnsi="Arial" ns0:eastAsia="Microsoft YaHei"/>
         </ns0:rPr>
-        <ns0:t>按料号匹配：用 Invoice 的 QAD PN 和 Packing list 的 QAD PN 匹配同一商品。</ns0:t>
+        <ns0:t>按料号匹配：先按标准化后的 QAD P/N 精确形式匹配；精确形式不存在时，再使用确认过的版本后缀候选键。</ns0:t>
       </ns0:r>
     </ns0:p>
     <ns0:p>
@@ -705,7 +705,7 @@
           <ns0:szCs ns0:val="21"/>
           <ns0:rFonts ns0:ascii="Arial" ns0:hAnsi="Arial" ns0:eastAsia="Microsoft YaHei"/>
         </ns0:rPr>
-        <ns0:t xml:space="preserve">填写报关单：按字段来源表把基础信息和商品明细写入空白模板；生成文件不得保留隐藏行。</ns0:t>
+        <ns0:t>填写报关单：按程序已实现并在字段来源表记录的规则写入空白模板；生成文件不得保留隐藏行。</ns0:t>
       </ns0:r>
     </ns0:p>
     <ns0:p>
@@ -995,16 +995,10 @@
           </ns0:tcPr>
           <ns0:p>
             <ns0:pPr>
-              <ns0:spacing ns0:before="0" ns0:after="0" ns0:line="260" ns0:lineRule="auto"/>
-            </ns0:pPr>
-            <ns0:r>
-              <ns0:rPr>
-                <ns0:color ns0:val="000000"/>
-                <ns0:sz ns0:val="17"/>
-                <ns0:szCs ns0:val="17"/>
-                <ns0:rFonts ns0:ascii="Arial" ns0:hAnsi="Arial" ns0:eastAsia="Microsoft YaHei"/>
-              </ns0:rPr>
-              <ns0:t>出口日期</ns0:t>
+              <ns0:keepLines/>
+            </ns0:pPr>
+            <ns0:r>
+              <ns0:t>申报日期</ns0:t>
             </ns0:r>
           </ns0:p>
         </ns0:tc>
@@ -1022,16 +1016,10 @@
           </ns0:tcPr>
           <ns0:p>
             <ns0:pPr>
-              <ns0:spacing ns0:before="0" ns0:after="0" ns0:line="260" ns0:lineRule="auto"/>
-            </ns0:pPr>
-            <ns0:r>
-              <ns0:rPr>
-                <ns0:color ns0:val="000000"/>
-                <ns0:sz ns0:val="17"/>
-                <ns0:szCs ns0:val="17"/>
-                <ns0:rFonts ns0:ascii="Arial" ns0:hAnsi="Arial" ns0:eastAsia="Microsoft YaHei"/>
-              </ns0:rPr>
-              <ns0:t>Invoice 或 Packing 表头 pick up Date</ns0:t>
+              <ns0:keepLines/>
+            </ns0:pPr>
+            <ns0:r>
+              <ns0:t>Invoice / Packing list</ns0:t>
             </ns0:r>
           </ns0:p>
         </ns0:tc>
@@ -1049,16 +1037,10 @@
           </ns0:tcPr>
           <ns0:p>
             <ns0:pPr>
-              <ns0:spacing ns0:before="0" ns0:after="0" ns0:line="260" ns0:lineRule="auto"/>
-            </ns0:pPr>
-            <ns0:r>
-              <ns0:rPr>
-                <ns0:color ns0:val="000000"/>
-                <ns0:sz ns0:val="17"/>
-                <ns0:szCs ns0:val="17"/>
-                <ns0:rFonts ns0:ascii="Arial" ns0:hAnsi="Arial" ns0:eastAsia="Microsoft YaHei"/>
-              </ns0:rPr>
-              <ns0:t>取日期值；如果是 Excel 日期序列，可转为日期。</ns0:t>
+              <ns0:keepLines/>
+            </ns0:pPr>
+            <ns0:r>
+              <ns0:t>pick up Date / 日期</ns0:t>
             </ns0:r>
           </ns0:p>
         </ns0:tc>
@@ -1076,16 +1058,10 @@
           </ns0:tcPr>
           <ns0:p>
             <ns0:pPr>
-              <ns0:spacing ns0:before="0" ns0:after="0" ns0:line="260" ns0:lineRule="auto"/>
-            </ns0:pPr>
-            <ns0:r>
-              <ns0:rPr>
-                <ns0:color ns0:val="000000"/>
-                <ns0:sz ns0:val="17"/>
-                <ns0:szCs ns0:val="17"/>
-                <ns0:rFonts ns0:ascii="Arial" ns0:hAnsi="Arial" ns0:eastAsia="Microsoft YaHei"/>
-              </ns0:rPr>
-              <ns0:t>留空</ns0:t>
+              <ns0:keepLines/>
+            </ns0:pPr>
+            <ns0:r>
+              <ns0:t>转换为日期后填写“申报日期”；“出口日期”保持空白</ns0:t>
             </ns0:r>
           </ns0:p>
         </ns0:tc>
@@ -1352,16 +1328,10 @@
           </ns0:tcPr>
           <ns0:p>
             <ns0:pPr>
-              <ns0:spacing ns0:before="0" ns0:after="0" ns0:line="260" ns0:lineRule="auto"/>
-            </ns0:pPr>
-            <ns0:r>
-              <ns0:rPr>
-                <ns0:color ns0:val="000000"/>
-                <ns0:sz ns0:val="17"/>
-                <ns0:szCs ns0:val="17"/>
-                <ns0:rFonts ns0:ascii="Arial" ns0:hAnsi="Arial" ns0:eastAsia="Microsoft YaHei"/>
-              </ns0:rPr>
-              <ns0:t xml:space="preserve">Invoice 的 Ship to 或 Bill to</ns0:t>
+              <ns0:keepLines/>
+            </ns0:pPr>
+            <ns0:r>
+              <ns0:t>Invoice</ns0:t>
             </ns0:r>
           </ns0:p>
         </ns0:tc>
@@ -1379,16 +1349,10 @@
           </ns0:tcPr>
           <ns0:p>
             <ns0:pPr>
-              <ns0:spacing ns0:before="0" ns0:after="0" ns0:line="260" ns0:lineRule="auto"/>
-            </ns0:pPr>
-            <ns0:r>
-              <ns0:rPr>
-                <ns0:color ns0:val="000000"/>
-                <ns0:sz ns0:val="17"/>
-                <ns0:szCs ns0:val="17"/>
-                <ns0:rFonts ns0:ascii="Arial" ns0:hAnsi="Arial" ns0:eastAsia="Microsoft YaHei"/>
-              </ns0:rPr>
-              <ns0:t xml:space="preserve">优先取 Ship to 下方公司名；没有时取 Bill to 下方公司名，例如 VINFAST TRADING AND PRODUCTION JOINT STOCK COMPANY。</ns0:t>
+              <ns0:keepLines/>
+            </ns0:pPr>
+            <ns0:r>
+              <ns0:t>Bill to / Ship to</ns0:t>
             </ns0:r>
           </ns0:p>
         </ns0:tc>
@@ -1406,16 +1370,10 @@
           </ns0:tcPr>
           <ns0:p>
             <ns0:pPr>
-              <ns0:spacing ns0:before="0" ns0:after="0" ns0:line="260" ns0:lineRule="auto"/>
-            </ns0:pPr>
-            <ns0:r>
-              <ns0:rPr>
-                <ns0:color ns0:val="000000"/>
-                <ns0:sz ns0:val="17"/>
-                <ns0:szCs ns0:val="17"/>
-                <ns0:rFonts ns0:ascii="Arial" ns0:hAnsi="Arial" ns0:eastAsia="Microsoft YaHei"/>
-              </ns0:rPr>
-              <ns0:t>留空</ns0:t>
+              <ns0:keepLines/>
+            </ns0:pPr>
+            <ns0:r>
+              <ns0:t>优先取 Bill to 下方公司名；为空时取 Ship to 下方公司名</ns0:t>
             </ns0:r>
           </ns0:p>
         </ns0:tc>
@@ -2467,16 +2425,10 @@
           </ns0:tcPr>
           <ns0:p>
             <ns0:pPr>
-              <ns0:spacing ns0:before="0" ns0:after="0" ns0:line="260" ns0:lineRule="auto"/>
-            </ns0:pPr>
-            <ns0:r>
-              <ns0:rPr>
-                <ns0:color ns0:val="000000"/>
-                <ns0:sz ns0:val="17"/>
-                <ns0:szCs ns0:val="17"/>
-                <ns0:rFonts ns0:ascii="Arial" ns0:hAnsi="Arial" ns0:eastAsia="Microsoft YaHei"/>
-              </ns0:rPr>
-              <ns0:t>Daily/商品主数据中的 HS Code</ns0:t>
+              <ns0:keepLines/>
+            </ns0:pPr>
+            <ns0:r>
+              <ns0:t>Daily/商品主数据</ns0:t>
             </ns0:r>
           </ns0:p>
         </ns0:tc>
@@ -2494,16 +2446,10 @@
           </ns0:tcPr>
           <ns0:p>
             <ns0:pPr>
-              <ns0:spacing ns0:before="0" ns0:after="0" ns0:line="260" ns0:lineRule="auto"/>
-            </ns0:pPr>
-            <ns0:r>
-              <ns0:rPr>
-                <ns0:color ns0:val="000000"/>
-                <ns0:sz ns0:val="17"/>
-                <ns0:szCs ns0:val="17"/>
-                <ns0:rFonts ns0:ascii="Arial" ns0:hAnsi="Arial" ns0:eastAsia="Microsoft YaHei"/>
-              </ns0:rPr>
-              <ns0:t>保留完整编码，不按数字截断。</ns0:t>
+              <ns0:keepLines/>
+            </ns0:pPr>
+            <ns0:r>
+              <ns0:t>按 QAD P/N 查找；优先取更新hs code，空白时取 HS Code；保留完整编码</ns0:t>
             </ns0:r>
           </ns0:p>
         </ns0:tc>
@@ -2550,16 +2496,10 @@
           </ns0:tcPr>
           <ns0:p>
             <ns0:pPr>
-              <ns0:spacing ns0:before="0" ns0:after="0" ns0:line="260" ns0:lineRule="auto"/>
-            </ns0:pPr>
-            <ns0:r>
-              <ns0:rPr>
-                <ns0:color ns0:val="000000"/>
-                <ns0:sz ns0:val="17"/>
-                <ns0:szCs ns0:val="17"/>
-                <ns0:rFonts ns0:ascii="Arial" ns0:hAnsi="Arial" ns0:eastAsia="Microsoft YaHei"/>
-              </ns0:rPr>
-              <ns0:t>Daily/商品主数据中的中文品名</ns0:t>
+              <ns0:keepLines/>
+            </ns0:pPr>
+            <ns0:r>
+              <ns0:t>Daily/商品主数据</ns0:t>
             </ns0:r>
           </ns0:p>
         </ns0:tc>
@@ -2577,16 +2517,10 @@
           </ns0:tcPr>
           <ns0:p>
             <ns0:pPr>
-              <ns0:spacing ns0:before="0" ns0:after="0" ns0:line="260" ns0:lineRule="auto"/>
-            </ns0:pPr>
-            <ns0:r>
-              <ns0:rPr>
-                <ns0:color ns0:val="000000"/>
-                <ns0:sz ns0:val="17"/>
-                <ns0:szCs ns0:val="17"/>
-                <ns0:rFonts ns0:ascii="Arial" ns0:hAnsi="Arial" ns0:eastAsia="Microsoft YaHei"/>
-              </ns0:rPr>
-              <ns0:t>以中文报关品名为准，不直接填英文 Description。</ns0:t>
+              <ns0:keepLines/>
+            </ns0:pPr>
+            <ns0:r>
+              <ns0:t>只从 Daily/商品主数据取得中文品名，不直接使用 Invoice 英文描述</ns0:t>
             </ns0:r>
           </ns0:p>
         </ns0:tc>
@@ -3131,16 +3065,10 @@
           </ns0:tcPr>
           <ns0:p>
             <ns0:pPr>
-              <ns0:spacing ns0:before="0" ns0:after="0" ns0:line="260" ns0:lineRule="auto"/>
-            </ns0:pPr>
-            <ns0:r>
-              <ns0:rPr>
-                <ns0:color ns0:val="000000"/>
-                <ns0:sz ns0:val="17"/>
-                <ns0:szCs ns0:val="17"/>
-                <ns0:rFonts ns0:ascii="Arial" ns0:hAnsi="Arial" ns0:eastAsia="Microsoft YaHei"/>
-              </ns0:rPr>
-              <ns0:t xml:space="preserve">Daily/商品主数据中的品牌；Invoice 不作为品牌来源</ns0:t>
+              <ns0:keepLines/>
+            </ns0:pPr>
+            <ns0:r>
+              <ns0:t>Daily/商品主数据</ns0:t>
             </ns0:r>
           </ns0:p>
         </ns0:tc>
@@ -3158,16 +3086,10 @@
           </ns0:tcPr>
           <ns0:p>
             <ns0:pPr>
-              <ns0:spacing ns0:before="0" ns0:after="0" ns0:line="260" ns0:lineRule="auto"/>
-            </ns0:pPr>
-            <ns0:r>
-              <ns0:rPr>
-                <ns0:color ns0:val="000000"/>
-                <ns0:sz ns0:val="17"/>
-                <ns0:szCs ns0:val="17"/>
-                <ns0:rFonts ns0:ascii="Arial" ns0:hAnsi="Arial" ns0:eastAsia="Microsoft YaHei"/>
-              </ns0:rPr>
-              <ns0:t>品牌先标准化；车型不写入品牌行。</ns0:t>
+              <ns0:keepLines/>
+            </ns0:pPr>
+            <ns0:r>
+              <ns0:t>品牌只从 Daily/商品主数据取得并标准化；车型不写入品牌行</ns0:t>
             </ns0:r>
           </ns0:p>
         </ns0:tc>
@@ -3398,30 +3320,12 @@
           </ns0:tcPr>
           <ns0:p>
             <ns0:pPr>
-              <ns0:spacing ns0:before="0" ns0:after="40" ns0:line="300" ns0:lineRule="auto"/>
-            </ns0:pPr>
-            <ns0:r>
-              <ns0:rPr>
-                <ns0:b/>
-                <ns0:color ns0:val="1F4E78"/>
-                <ns0:sz ns0:val="22"/>
-                <ns0:szCs ns0:val="22"/>
-                <ns0:rFonts ns0:ascii="Arial" ns0:hAnsi="Arial" ns0:eastAsia="Microsoft YaHei"/>
-              </ns0:rPr>
-              <ns0:t xml:space="preserve">核心匹配键</ns0:t>
-            </ns0:r>
-          </ns0:p>
-          <ns0:p>
-            <ns0:pPr>
-              <ns0:spacing ns0:before="0" ns0:after="0" ns0:line="300" ns0:lineRule="auto"/>
-            </ns0:pPr>
-            <ns0:r>
-              <ns0:rPr>
-                <ns0:sz ns0:val="20"/>
-                <ns0:szCs ns0:val="20"/>
-                <ns0:rFonts ns0:ascii="Arial" ns0:hAnsi="Arial" ns0:eastAsia="Microsoft YaHei"/>
-              </ns0:rPr>
-              <ns0:t xml:space="preserve">优先用 QAD PN / part_no 做精确匹配。也就是说，Invoice 中某个料号的数量和金额，去 Packing list 中找同一个料号的净重、毛重；托盘数/件数从 total 行、无 total 字样总计行或“6 pallets”等文本识别。</ns0:t>
+              <ns0:keepLines/>
+            </ns0:pPr>
+            <ns0:r>
+              <ns0:t>核心匹配键</ns0:t>
+              <ns0:br/>
+              <ns0:t>优先按标准化后的 QAD P/N 精确形式匹配。精确形式不存在时，才按已确认的版本后缀候选键匹配；出现申报要素冲突时停止自动选择。</ns0:t>
             </ns0:r>
           </ns0:p>
         </ns0:tc>
@@ -3453,6 +3357,9 @@
         <ns0:gridCol ns0:w="1700"/>
       </ns0:tblGrid>
       <ns0:tr>
+        <ns0:trPr>
+          <ns0:tblHeader ns0:val="true"/>
+        </ns0:trPr>
         <ns0:tc>
           <ns0:tcPr>
             <ns0:tcW ns0:w="1300" ns0:type="dxa"/>
@@ -3581,15 +3488,9 @@
           </ns0:tcPr>
           <ns0:p>
             <ns0:pPr>
-              <ns0:spacing ns0:before="0" ns0:after="0" ns0:line="260" ns0:lineRule="auto"/>
-            </ns0:pPr>
-            <ns0:r>
-              <ns0:rPr>
-                <ns0:color ns0:val="000000"/>
-                <ns0:sz ns0:val="17"/>
-                <ns0:szCs ns0:val="17"/>
-                <ns0:rFonts ns0:ascii="Arial" ns0:hAnsi="Arial" ns0:eastAsia="Microsoft YaHei"/>
-              </ns0:rPr>
+              <ns0:keepLines/>
+            </ns0:pPr>
+            <ns0:r>
               <ns0:t>1</ns0:t>
             </ns0:r>
           </ns0:p>
@@ -3608,16 +3509,10 @@
           </ns0:tcPr>
           <ns0:p>
             <ns0:pPr>
-              <ns0:spacing ns0:before="0" ns0:after="0" ns0:line="260" ns0:lineRule="auto"/>
-            </ns0:pPr>
-            <ns0:r>
-              <ns0:rPr>
-                <ns0:color ns0:val="000000"/>
-                <ns0:sz ns0:val="17"/>
-                <ns0:szCs ns0:val="17"/>
-                <ns0:rFonts ns0:ascii="Arial" ns0:hAnsi="Arial" ns0:eastAsia="Microsoft YaHei"/>
-              </ns0:rPr>
-              <ns0:t>Invoice.QAD PN = Packing.QAD PN</ns0:t>
+              <ns0:keepLines/>
+            </ns0:pPr>
+            <ns0:r>
+              <ns0:t>标准化后的精确形式</ns0:t>
             </ns0:r>
           </ns0:p>
         </ns0:tc>
@@ -3635,16 +3530,10 @@
           </ns0:tcPr>
           <ns0:p>
             <ns0:pPr>
-              <ns0:spacing ns0:before="0" ns0:after="0" ns0:line="260" ns0:lineRule="auto"/>
-            </ns0:pPr>
-            <ns0:r>
-              <ns0:rPr>
-                <ns0:color ns0:val="000000"/>
-                <ns0:sz ns0:val="17"/>
-                <ns0:szCs ns0:val="17"/>
-                <ns0:rFonts ns0:ascii="Arial" ns0:hAnsi="Arial" ns0:eastAsia="Microsoft YaHei"/>
-              </ns0:rPr>
-              <ns0:t>当前主规则，最稳定。</ns0:t>
+              <ns0:keepLines/>
+            </ns0:pPr>
+            <ns0:r>
+              <ns0:t>统一全角/半角、删除空白和分隔符；纯数字料号忽略首尾零；纯数字 Excel .0 去除。精确形式优先使用。</ns0:t>
             </ns0:r>
           </ns0:p>
         </ns0:tc>
@@ -3662,15 +3551,9 @@
           </ns0:tcPr>
           <ns0:p>
             <ns0:pPr>
-              <ns0:spacing ns0:before="0" ns0:after="0" ns0:line="260" ns0:lineRule="auto"/>
-            </ns0:pPr>
-            <ns0:r>
-              <ns0:rPr>
-                <ns0:color ns0:val="000000"/>
-                <ns0:sz ns0:val="17"/>
-                <ns0:szCs ns0:val="17"/>
-                <ns0:rFonts ns0:ascii="Arial" ns0:hAnsi="Arial" ns0:eastAsia="Microsoft YaHei"/>
-              </ns0:rPr>
+              <ns0:keepLines/>
+            </ns0:pPr>
+            <ns0:r>
               <ns0:t>进入异常清单</ns0:t>
             </ns0:r>
           </ns0:p>
@@ -3691,15 +3574,95 @@
           </ns0:tcPr>
           <ns0:p>
             <ns0:pPr>
-              <ns0:spacing ns0:before="0" ns0:after="0" ns0:line="260" ns0:lineRule="auto"/>
-            </ns0:pPr>
-            <ns0:r>
-              <ns0:rPr>
-                <ns0:color ns0:val="000000"/>
-                <ns0:sz ns0:val="17"/>
-                <ns0:szCs ns0:val="17"/>
-                <ns0:rFonts ns0:ascii="Arial" ns0:hAnsi="Arial" ns0:eastAsia="Microsoft YaHei"/>
-              </ns0:rPr>
+              <ns0:keepLines/>
+            </ns0:pPr>
+            <ns0:r>
+              <ns0:t>2</ns0:t>
+            </ns0:r>
+          </ns0:p>
+        </ns0:tc>
+        <ns0:tc>
+          <ns0:tcPr>
+            <ns0:tcW ns0:w="2800" ns0:type="dxa"/>
+            <ns0:shd ns0:fill="FFFFFF"/>
+            <ns0:tcMar>
+              <ns0:top ns0:w="100" ns0:type="dxa"/>
+              <ns0:left ns0:w="110" ns0:type="dxa"/>
+              <ns0:bottom ns0:w="100" ns0:type="dxa"/>
+              <ns0:right ns0:w="110" ns0:type="dxa"/>
+            </ns0:tcMar>
+            <ns0:vAlign ns0:val="center"/>
+          </ns0:tcPr>
+          <ns0:p>
+            <ns0:pPr>
+              <ns0:keepLines/>
+            </ns0:pPr>
+            <ns0:r>
+              <ns0:t>确认过的版本后缀候选键</ns0:t>
+            </ns0:r>
+          </ns0:p>
+        </ns0:tc>
+        <ns0:tc>
+          <ns0:tcPr>
+            <ns0:tcW ns0:w="3200" ns0:type="dxa"/>
+            <ns0:shd ns0:fill="FFFFFF"/>
+            <ns0:tcMar>
+              <ns0:top ns0:w="100" ns0:type="dxa"/>
+              <ns0:left ns0:w="110" ns0:type="dxa"/>
+              <ns0:bottom ns0:w="100" ns0:type="dxa"/>
+              <ns0:right ns0:w="110" ns0:type="dxa"/>
+            </ns0:tcMar>
+            <ns0:vAlign ns0:val="center"/>
+          </ns0:tcPr>
+          <ns0:p>
+            <ns0:pPr>
+              <ns0:keepLines/>
+            </ns0:pPr>
+            <ns0:r>
+              <ns0:t>例如 ABC001-01 与 ABC001-02；也兼容 -03A、-01B2。Daily 补充表只做精确 QAD P/N 匹配。</ns0:t>
+            </ns0:r>
+          </ns0:p>
+        </ns0:tc>
+        <ns0:tc>
+          <ns0:tcPr>
+            <ns0:tcW ns0:w="1700" ns0:type="dxa"/>
+            <ns0:shd ns0:fill="FFFFFF"/>
+            <ns0:tcMar>
+              <ns0:top ns0:w="100" ns0:type="dxa"/>
+              <ns0:left ns0:w="110" ns0:type="dxa"/>
+              <ns0:bottom ns0:w="100" ns0:type="dxa"/>
+              <ns0:right ns0:w="110" ns0:type="dxa"/>
+            </ns0:tcMar>
+            <ns0:vAlign ns0:val="center"/>
+          </ns0:tcPr>
+          <ns0:p>
+            <ns0:pPr>
+              <ns0:keepLines/>
+            </ns0:pPr>
+            <ns0:r>
+              <ns0:t>进入异常清单</ns0:t>
+            </ns0:r>
+          </ns0:p>
+        </ns0:tc>
+      </ns0:tr>
+      <ns0:tr>
+        <ns0:tc>
+          <ns0:tcPr>
+            <ns0:tcW ns0:w="1300" ns0:type="dxa"/>
+            <ns0:shd ns0:fill="FFFFFF"/>
+            <ns0:tcMar>
+              <ns0:top ns0:w="100" ns0:type="dxa"/>
+              <ns0:left ns0:w="110" ns0:type="dxa"/>
+              <ns0:bottom ns0:w="100" ns0:type="dxa"/>
+              <ns0:right ns0:w="110" ns0:type="dxa"/>
+            </ns0:tcMar>
+            <ns0:vAlign ns0:val="center"/>
+          </ns0:tcPr>
+          <ns0:p>
+            <ns0:pPr>
+              <ns0:keepLines/>
+            </ns0:pPr>
+            <ns0:r>
               <ns0:t>3</ns0:t>
             </ns0:r>
           </ns0:p>
@@ -3718,16 +3681,10 @@
           </ns0:tcPr>
           <ns0:p>
             <ns0:pPr>
-              <ns0:spacing ns0:before="0" ns0:after="0" ns0:line="260" ns0:lineRule="auto"/>
-            </ns0:pPr>
-            <ns0:r>
-              <ns0:rPr>
-                <ns0:color ns0:val="000000"/>
-                <ns0:sz ns0:val="17"/>
-                <ns0:szCs ns0:val="17"/>
-                <ns0:rFonts ns0:ascii="Arial" ns0:hAnsi="Arial" ns0:eastAsia="Microsoft YaHei"/>
-              </ns0:rPr>
-              <ns0:t>商品主数据中的备用料号</ns0:t>
+              <ns0:keepLines/>
+            </ns0:pPr>
+            <ns0:r>
+              <ns0:t>商品主数据同一行的 Old Part No.</ns0:t>
             </ns0:r>
           </ns0:p>
         </ns0:tc>
@@ -3745,16 +3702,10 @@
           </ns0:tcPr>
           <ns0:p>
             <ns0:pPr>
-              <ns0:spacing ns0:before="0" ns0:after="0" ns0:line="260" ns0:lineRule="auto"/>
-            </ns0:pPr>
-            <ns0:r>
-              <ns0:rPr>
-                <ns0:color ns0:val="000000"/>
-                <ns0:sz ns0:val="17"/>
-                <ns0:szCs ns0:val="17"/>
-                <ns0:rFonts ns0:ascii="Arial" ns0:hAnsi="Arial" ns0:eastAsia="Microsoft YaHei"/>
-              </ns0:rPr>
-              <ns0:t>用于处理旧料号/新料号变化。</ns0:t>
+              <ns0:keepLines/>
+            </ns0:pPr>
+            <ns0:r>
+              <ns0:t>只有 QAD P/N 与 Old Part No. 在同一商品主数据行明确维护时，才视为已确认关系。</ns0:t>
             </ns0:r>
           </ns0:p>
         </ns0:tc>
@@ -3772,16 +3723,182 @@
           </ns0:tcPr>
           <ns0:p>
             <ns0:pPr>
-              <ns0:spacing ns0:before="0" ns0:after="0" ns0:line="260" ns0:lineRule="auto"/>
-            </ns0:pPr>
-            <ns0:r>
-              <ns0:rPr>
-                <ns0:color ns0:val="000000"/>
-                <ns0:sz ns0:val="17"/>
-                <ns0:szCs ns0:val="17"/>
-                <ns0:rFonts ns0:ascii="Arial" ns0:hAnsi="Arial" ns0:eastAsia="Microsoft YaHei"/>
-              </ns0:rPr>
-              <ns0:t>进入异常清单，等待人工确认</ns0:t>
+              <ns0:keepLines/>
+            </ns0:pPr>
+            <ns0:r>
+              <ns0:t>进入异常清单</ns0:t>
+            </ns0:r>
+          </ns0:p>
+        </ns0:tc>
+      </ns0:tr>
+      <ns0:tr>
+        <ns0:tc>
+          <ns0:tcPr>
+            <ns0:tcW ns0:w="1300" ns0:type="dxa"/>
+            <ns0:shd ns0:fill="FFFFFF"/>
+            <ns0:tcMar>
+              <ns0:top ns0:w="100" ns0:type="dxa"/>
+              <ns0:left ns0:w="110" ns0:type="dxa"/>
+              <ns0:bottom ns0:w="100" ns0:type="dxa"/>
+              <ns0:right ns0:w="110" ns0:type="dxa"/>
+            </ns0:tcMar>
+            <ns0:vAlign ns0:val="center"/>
+          </ns0:tcPr>
+          <ns0:p>
+            <ns0:pPr>
+              <ns0:keepLines/>
+            </ns0:pPr>
+            <ns0:r>
+              <ns0:t>禁止自动转换</ns0:t>
+            </ns0:r>
+          </ns0:p>
+        </ns0:tc>
+        <ns0:tc>
+          <ns0:tcPr>
+            <ns0:tcW ns0:w="2800" ns0:type="dxa"/>
+            <ns0:shd ns0:fill="FFFFFF"/>
+            <ns0:tcMar>
+              <ns0:top ns0:w="100" ns0:type="dxa"/>
+              <ns0:left ns0:w="110" ns0:type="dxa"/>
+              <ns0:bottom ns0:w="100" ns0:type="dxa"/>
+              <ns0:right ns0:w="110" ns0:type="dxa"/>
+            </ns0:tcMar>
+            <ns0:vAlign ns0:val="center"/>
+          </ns0:tcPr>
+          <ns0:p>
+            <ns0:pPr>
+              <ns0:keepLines/>
+            </ns0:pPr>
+            <ns0:r>
+              <ns0:t>客户/品牌前缀、O/0、I/1、无对应关系的新旧料号</ns0:t>
+            </ns0:r>
+          </ns0:p>
+        </ns0:tc>
+        <ns0:tc>
+          <ns0:tcPr>
+            <ns0:tcW ns0:w="3200" ns0:type="dxa"/>
+            <ns0:shd ns0:fill="FFFFFF"/>
+            <ns0:tcMar>
+              <ns0:top ns0:w="100" ns0:type="dxa"/>
+              <ns0:left ns0:w="110" ns0:type="dxa"/>
+              <ns0:bottom ns0:w="100" ns0:type="dxa"/>
+              <ns0:right ns0:w="110" ns0:type="dxa"/>
+            </ns0:tcMar>
+            <ns0:vAlign ns0:val="center"/>
+          </ns0:tcPr>
+          <ns0:p>
+            <ns0:pPr>
+              <ns0:keepLines/>
+            </ns0:pPr>
+            <ns0:r>
+              <ns0:t>这些差异按不同料号处理，不做猜测。</ns0:t>
+            </ns0:r>
+          </ns0:p>
+        </ns0:tc>
+        <ns0:tc>
+          <ns0:tcPr>
+            <ns0:tcW ns0:w="1700" ns0:type="dxa"/>
+            <ns0:shd ns0:fill="FFFFFF"/>
+            <ns0:tcMar>
+              <ns0:top ns0:w="100" ns0:type="dxa"/>
+              <ns0:left ns0:w="110" ns0:type="dxa"/>
+              <ns0:bottom ns0:w="100" ns0:type="dxa"/>
+              <ns0:right ns0:w="110" ns0:type="dxa"/>
+            </ns0:tcMar>
+            <ns0:vAlign ns0:val="center"/>
+          </ns0:tcPr>
+          <ns0:p>
+            <ns0:pPr>
+              <ns0:keepLines/>
+            </ns0:pPr>
+            <ns0:r>
+              <ns0:t>进入异常清单</ns0:t>
+            </ns0:r>
+          </ns0:p>
+        </ns0:tc>
+      </ns0:tr>
+      <ns0:tr>
+        <ns0:tc>
+          <ns0:tcPr>
+            <ns0:tcW ns0:w="1300" ns0:type="dxa"/>
+            <ns0:shd ns0:fill="FFFFFF"/>
+            <ns0:tcMar>
+              <ns0:top ns0:w="100" ns0:type="dxa"/>
+              <ns0:left ns0:w="110" ns0:type="dxa"/>
+              <ns0:bottom ns0:w="100" ns0:type="dxa"/>
+              <ns0:right ns0:w="110" ns0:type="dxa"/>
+            </ns0:tcMar>
+            <ns0:vAlign ns0:val="center"/>
+          </ns0:tcPr>
+          <ns0:p>
+            <ns0:pPr>
+              <ns0:keepLines/>
+            </ns0:pPr>
+            <ns0:r>
+              <ns0:t>冲突保护</ns0:t>
+            </ns0:r>
+          </ns0:p>
+        </ns0:tc>
+        <ns0:tc>
+          <ns0:tcPr>
+            <ns0:tcW ns0:w="2800" ns0:type="dxa"/>
+            <ns0:shd ns0:fill="FFFFFF"/>
+            <ns0:tcMar>
+              <ns0:top ns0:w="100" ns0:type="dxa"/>
+              <ns0:left ns0:w="110" ns0:type="dxa"/>
+              <ns0:bottom ns0:w="100" ns0:type="dxa"/>
+              <ns0:right ns0:w="110" ns0:type="dxa"/>
+            </ns0:tcMar>
+            <ns0:vAlign ns0:val="center"/>
+          </ns0:tcPr>
+          <ns0:p>
+            <ns0:pPr>
+              <ns0:keepLines/>
+            </ns0:pPr>
+            <ns0:r>
+              <ns0:t>同一候选键对应不同 HS code、中文品名或品牌</ns0:t>
+            </ns0:r>
+          </ns0:p>
+        </ns0:tc>
+        <ns0:tc>
+          <ns0:tcPr>
+            <ns0:tcW ns0:w="3200" ns0:type="dxa"/>
+            <ns0:shd ns0:fill="FFFFFF"/>
+            <ns0:tcMar>
+              <ns0:top ns0:w="100" ns0:type="dxa"/>
+              <ns0:left ns0:w="110" ns0:type="dxa"/>
+              <ns0:bottom ns0:w="100" ns0:type="dxa"/>
+              <ns0:right ns0:w="110" ns0:type="dxa"/>
+            </ns0:tcMar>
+            <ns0:vAlign ns0:val="center"/>
+          </ns0:tcPr>
+          <ns0:p>
+            <ns0:pPr>
+              <ns0:keepLines/>
+            </ns0:pPr>
+            <ns0:r>
+              <ns0:t>不自动选取任何一条，提示人工确认；只有全部申报要素一致才允许合并。</ns0:t>
+            </ns0:r>
+          </ns0:p>
+        </ns0:tc>
+        <ns0:tc>
+          <ns0:tcPr>
+            <ns0:tcW ns0:w="1700" ns0:type="dxa"/>
+            <ns0:shd ns0:fill="FFFFFF"/>
+            <ns0:tcMar>
+              <ns0:top ns0:w="100" ns0:type="dxa"/>
+              <ns0:left ns0:w="110" ns0:type="dxa"/>
+              <ns0:bottom ns0:w="100" ns0:type="dxa"/>
+              <ns0:right ns0:w="110" ns0:type="dxa"/>
+            </ns0:tcMar>
+            <ns0:vAlign ns0:val="center"/>
+          </ns0:tcPr>
+          <ns0:p>
+            <ns0:pPr>
+              <ns0:keepLines/>
+            </ns0:pPr>
+            <ns0:r>
+              <ns0:t>必须人工确认</ns0:t>
             </ns0:r>
           </ns0:p>
         </ns0:tc>
@@ -3810,7 +3927,7 @@
           <ns0:szCs ns0:val="22"/>
           <ns0:rFonts ns0:ascii="Arial" ns0:hAnsi="Arial" ns0:eastAsia="Microsoft YaHei"/>
         </ns0:rPr>
-        <ns0:t xml:space="preserve">注意：新增无关字段不会影响匹配。只要 QAD PN、qty./Quantity/Quantity (EA)、Amount、N.W.(KG)/N W (KGS) 等必要字段仍能通过字段映射表识别，程序就可以继续处理。</ns0:t>
+        <ns0:t>注意：新增无关字段不会影响匹配。核心字段出现新名称时，应先在字段映射表记录，再确认程序已支持；未支持时需要同步更新程序。</ns0:t>
       </ns0:r>
     </ns0:p>
     <ns0:p>
@@ -6694,16 +6811,10 @@
           </ns0:tcPr>
           <ns0:p>
             <ns0:pPr>
-              <ns0:spacing ns0:before="0" ns0:after="0" ns0:line="260" ns0:lineRule="auto"/>
-            </ns0:pPr>
-            <ns0:r>
-              <ns0:rPr>
-                <ns0:color ns0:val="000000"/>
-                <ns0:sz ns0:val="17"/>
-                <ns0:szCs ns0:val="17"/>
-                <ns0:rFonts ns0:ascii="Arial" ns0:hAnsi="Arial" ns0:eastAsia="Microsoft YaHei"/>
-              </ns0:rPr>
-              <ns0:t>指出文件类型、缺失字段、可在字段映射表新增别名</ns0:t>
+              <ns0:keepLines/>
+            </ns0:pPr>
+            <ns0:r>
+              <ns0:t>记录新别名；程序未支持时同步更新</ns0:t>
             </ns0:r>
           </ns0:p>
         </ns0:tc>
@@ -6777,16 +6888,10 @@
           </ns0:tcPr>
           <ns0:p>
             <ns0:pPr>
-              <ns0:spacing ns0:before="0" ns0:after="0" ns0:line="260" ns0:lineRule="auto"/>
-            </ns0:pPr>
-            <ns0:r>
-              <ns0:rPr>
-                <ns0:color ns0:val="000000"/>
-                <ns0:sz ns0:val="17"/>
-                <ns0:szCs ns0:val="17"/>
-                <ns0:rFonts ns0:ascii="Arial" ns0:hAnsi="Arial" ns0:eastAsia="Microsoft YaHei"/>
-              </ns0:rPr>
-              <ns0:t>列出料号，提示检查 QAD PN 或备用料号</ns0:t>
+              <ns0:keepLines/>
+            </ns0:pPr>
+            <ns0:r>
+              <ns0:t>检查精确键、版本键和明确 Old Part No.</ns0:t>
             </ns0:r>
           </ns0:p>
         </ns0:tc>
@@ -7082,6 +7187,9 @@
         <ns0:gridCol ns0:w="9000"/>
       </ns0:tblGrid>
       <ns0:tr>
+        <ns0:trPr>
+          <ns0:cantSplit/>
+        </ns0:trPr>
         <ns0:tc>
           <ns0:tcPr>
             <ns0:tcW ns0:w="9000" ns0:type="dxa"/>
@@ -7095,30 +7203,12 @@
           </ns0:tcPr>
           <ns0:p>
             <ns0:pPr>
-              <ns0:spacing ns0:before="0" ns0:after="40" ns0:line="300" ns0:lineRule="auto"/>
-            </ns0:pPr>
-            <ns0:r>
-              <ns0:rPr>
-                <ns0:b/>
-                <ns0:color ns0:val="1F4E78"/>
-                <ns0:sz ns0:val="22"/>
-                <ns0:szCs ns0:val="22"/>
-                <ns0:rFonts ns0:ascii="Arial" ns0:hAnsi="Arial" ns0:eastAsia="Microsoft YaHei"/>
-              </ns0:rPr>
-              <ns0:t xml:space="preserve">当前匹配逻辑总结</ns0:t>
-            </ns0:r>
-          </ns0:p>
-          <ns0:p>
-            <ns0:pPr>
-              <ns0:spacing ns0:before="0" ns0:after="0" ns0:line="300" ns0:lineRule="auto"/>
-            </ns0:pPr>
-            <ns0:r>
-              <ns0:rPr>
-                <ns0:sz ns0:val="20"/>
-                <ns0:szCs ns0:val="20"/>
-                <ns0:rFonts ns0:ascii="Arial" ns0:hAnsi="Arial" ns0:eastAsia="Microsoft YaHei"/>
-              </ns0:rPr>
-              <ns0:t xml:space="preserve">当前逻辑是：Invoice 负责发票号、日期、客户、运输方式、成交方式、料号、数量、单价、总价和币制；发票号从 Serial No. 取，支持 SP/PS 等编号；境外收货人优先从 Ship to 公司名取；贸易国=Bill to 国家，运抵国=Ship to 国家，英文国家名翻译成中文，最终目的国=运抵国。Packing list 负责重量、包装、托盘数/件数，支持 Quantity (EA)、N W/G W、6 pallets 等写法；Daily/商品主数据是料号对应 HS code、中文品名、品牌的唯一来源；空白模板只提供格式；旧报关单不提供业务数值；生成文件不得保留隐藏行。商品按 HS code + 中文品名 + 品牌 + 币制 + 目的国 合并，车型不参与合并。运输方式按水路/航空标准化；监管方式、征免性质、离境口岸、商品行征免按固定默认值填写。</ns0:t>
+              <ns0:keepLines/>
+            </ns0:pPr>
+            <ns0:r>
+              <ns0:t>当前匹配逻辑总结</ns0:t>
+              <ns0:br/>
+              <ns0:t>Invoice 提供交易数据，Packing list 提供重量和包装，Daily/商品主数据唯一提供 HS code、中文品名和品牌。料号精确形式优先，版本候选键次之；前缀、O/0、I/1和无明确关系的新旧料号不自动归并，冲突转人工。商品按 HS code + 中文品名 + 品牌 + 币制 + 最终目的国合并，车型不参与。</ns0:t>
             </ns0:r>
           </ns0:p>
         </ns0:tc>
@@ -7126,11 +7216,12 @@
     </ns0:tbl>
     <ns0:p>
       <ns0:pPr>
-        <ns0:spacing ns0:before="100" ns0:after="100" ns0:line="300" ns0:lineRule="auto"/>
+        <ns0:spacing ns0:before="0" ns0:after="0" ns0:line="20" ns0:lineRule="exact"/>
       </ns0:pPr>
       <ns0:r>
         <ns0:rPr>
-          <ns0:sz ns0:val="22"/>
+          <ns0:vanish/>
+          <ns0:sz ns0:val="2"/>
           <ns0:szCs ns0:val="22"/>
           <ns0:rFonts ns0:ascii="Arial" ns0:hAnsi="Arial" ns0:eastAsia="Microsoft YaHei"/>
         </ns0:rPr>

</xml_diff>